<commit_message>
Update Respicompass Round 1, 2024-2025.docx
</commit_message>
<xml_diff>
--- a/documentation/Respicompass Round 1, 2024-2025.docx
+++ b/documentation/Respicompass Round 1, 2024-2025.docx
@@ -14,287 +14,10 @@
     </w:p>
     <w:p/>
     <w:p>
-      <w:pPr>
-        <w:rPr>
-          <w:b/>
-          <w:sz w:val="28"/>
-          <w:szCs w:val="28"/>
-        </w:rPr>
-      </w:pPr>
-      <w:r>
-        <w:rPr>
-          <w:b/>
-          <w:sz w:val="28"/>
-          <w:szCs w:val="28"/>
-        </w:rPr>
-        <w:t>Covid-19</w:t>
-      </w:r>
-    </w:p>
-    <w:p>
-      <w:pPr>
-        <w:pStyle w:val="Heading3"/>
-      </w:pPr>
-      <w:bookmarkStart w:id="1" w:name="_ejbscchgm8n2" w:colFirst="0" w:colLast="0"/>
-      <w:bookmarkEnd w:id="1"/>
-      <w:r>
-        <w:t>Initial conditions and epidemiological context</w:t>
-      </w:r>
-    </w:p>
-    <w:p>
-      <w:pPr>
-        <w:numPr>
-          <w:ilvl w:val="0"/>
-          <w:numId w:val="1"/>
-        </w:numPr>
-      </w:pPr>
-      <w:r>
-        <w:t>How did you estimate initial conditions and how do you address the unknowns about history of exposure and vaccination at the beginning of the projection period? E.g. how much historical data is fitted? What is assumed/fitted about seroprevalence? How many initial infections and where? epidemiological parameters (R0, Rt, recovery rate, hospitalisation rate), etc.</w:t>
-      </w:r>
-    </w:p>
-    <w:p/>
-    <w:p>
-      <w:pPr>
-        <w:numPr>
-          <w:ilvl w:val="0"/>
-          <w:numId w:val="1"/>
-        </w:numPr>
-      </w:pPr>
-      <w:r>
-        <w:t xml:space="preserve">Does your model include any seasonality effect on transmission? If yes, what do you assume about amplitude and peak timing? </w:t>
-      </w:r>
-    </w:p>
-    <w:p/>
-    <w:p>
-      <w:pPr>
-        <w:numPr>
-          <w:ilvl w:val="0"/>
-          <w:numId w:val="1"/>
-        </w:numPr>
-      </w:pPr>
-      <w:r>
-        <w:t>How did you handle countries with missing data in the epidemiological targets?</w:t>
-      </w:r>
-    </w:p>
-    <w:p/>
-    <w:p>
-      <w:pPr>
-        <w:numPr>
-          <w:ilvl w:val="0"/>
-          <w:numId w:val="1"/>
-        </w:numPr>
-      </w:pPr>
-      <w:r>
-        <w:t>What is/are the main driver(s) of uncertainty in your model?</w:t>
-      </w:r>
-    </w:p>
-    <w:p>
-      <w:pPr>
-        <w:pStyle w:val="Heading3"/>
-      </w:pPr>
-      <w:bookmarkStart w:id="2" w:name="_87lgo8eodngi" w:colFirst="0" w:colLast="0"/>
-      <w:bookmarkEnd w:id="2"/>
-      <w:r>
-        <w:t>Specific groups/Risk Groups</w:t>
-      </w:r>
-    </w:p>
-    <w:p/>
-    <w:p>
-      <w:pPr>
-        <w:numPr>
-          <w:ilvl w:val="0"/>
-          <w:numId w:val="1"/>
-        </w:numPr>
-      </w:pPr>
-      <w:r>
-        <w:t xml:space="preserve">Does your model explicitly account for age? If so, what age groups are you considering in the simulations? What are the modelled differences between age groups? </w:t>
-      </w:r>
-    </w:p>
-    <w:p/>
-    <w:p>
-      <w:pPr>
-        <w:numPr>
-          <w:ilvl w:val="0"/>
-          <w:numId w:val="1"/>
-        </w:numPr>
-      </w:pPr>
-      <w:r>
-        <w:t>Does your model incorporate additional risk groups beyond those defined by age? Which ones? And how do you include it in your model? E.g. higher susceptibility, higher vulnerability to being hospitalised, etc.</w:t>
-      </w:r>
-    </w:p>
-    <w:p>
-      <w:pPr>
-        <w:pStyle w:val="Heading3"/>
-      </w:pPr>
-      <w:bookmarkStart w:id="3" w:name="_lqw87ulxj6s5" w:colFirst="0" w:colLast="0"/>
-      <w:bookmarkEnd w:id="3"/>
-      <w:r>
-        <w:t>Contact patterns</w:t>
-      </w:r>
-    </w:p>
-    <w:p>
-      <w:pPr>
-        <w:numPr>
-          <w:ilvl w:val="0"/>
-          <w:numId w:val="1"/>
-        </w:numPr>
-      </w:pPr>
-      <w:r>
-        <w:t>Does your model consider country-specific population demographics and contact rates? How do you estimate country-specific contact rates? Provide data sources if available.</w:t>
-      </w:r>
-    </w:p>
-    <w:p/>
-    <w:p>
-      <w:pPr>
-        <w:numPr>
-          <w:ilvl w:val="0"/>
-          <w:numId w:val="1"/>
-        </w:numPr>
-      </w:pPr>
-      <w:r>
-        <w:t>Do contact rates vary over time? In what way?</w:t>
-      </w:r>
-    </w:p>
-    <w:p/>
-    <w:p>
-      <w:pPr>
-        <w:numPr>
-          <w:ilvl w:val="0"/>
-          <w:numId w:val="1"/>
-        </w:numPr>
-      </w:pPr>
-      <w:r>
-        <w:t>Do you include specific population groups' contact rates in your model? If yes, how do you estimate these contact rates?</w:t>
-      </w:r>
-    </w:p>
-    <w:p/>
-    <w:p>
-      <w:pPr>
-        <w:pStyle w:val="Heading3"/>
-      </w:pPr>
-      <w:bookmarkStart w:id="4" w:name="_b7dpid42bzrp" w:colFirst="0" w:colLast="0"/>
-      <w:bookmarkEnd w:id="4"/>
-      <w:r>
-        <w:lastRenderedPageBreak/>
-        <w:t>Behaviour and Mobility/Travel</w:t>
-      </w:r>
-    </w:p>
-    <w:p>
-      <w:pPr>
-        <w:numPr>
-          <w:ilvl w:val="0"/>
-          <w:numId w:val="1"/>
-        </w:numPr>
-      </w:pPr>
-      <w:r>
-        <w:t>Does your model incorporate behavioural aspects? E.g. adoption of self-protective measures such as masks, social distancing, vaccination etc. based for example on perceived severity of epidemiological conditions</w:t>
-      </w:r>
-    </w:p>
-    <w:p/>
-    <w:p>
-      <w:pPr>
-        <w:numPr>
-          <w:ilvl w:val="0"/>
-          <w:numId w:val="1"/>
-        </w:numPr>
-      </w:pPr>
-      <w:r>
-        <w:t>Does your model consider explicit country-specific mobility patterns for the various population groups? If yes, how do you estimate these mobility patterns?</w:t>
-      </w:r>
-    </w:p>
-    <w:p/>
-    <w:p>
-      <w:pPr>
-        <w:pStyle w:val="Heading3"/>
-      </w:pPr>
-      <w:bookmarkStart w:id="5" w:name="_iyzynhxgt5zo" w:colFirst="0" w:colLast="0"/>
-      <w:bookmarkEnd w:id="5"/>
-      <w:r>
-        <w:t>Immunity and Vaccination</w:t>
-      </w:r>
-    </w:p>
-    <w:p>
-      <w:pPr>
-        <w:numPr>
-          <w:ilvl w:val="0"/>
-          <w:numId w:val="1"/>
-        </w:numPr>
-      </w:pPr>
-      <w:r>
-        <w:t>How is the vaccination rollout implemented in the model? (i.e., number of doses distributed over time, step-wise vaccination rollout, etc)</w:t>
-      </w:r>
-    </w:p>
-    <w:p/>
-    <w:p>
-      <w:pPr>
-        <w:numPr>
-          <w:ilvl w:val="0"/>
-          <w:numId w:val="1"/>
-        </w:numPr>
-      </w:pPr>
-      <w:r>
-        <w:t>How did you implement the vaccination rollout in age groups other than 60+?</w:t>
-      </w:r>
-    </w:p>
-    <w:p/>
-    <w:p>
-      <w:pPr>
-        <w:numPr>
-          <w:ilvl w:val="0"/>
-          <w:numId w:val="1"/>
-        </w:numPr>
-      </w:pPr>
-      <w:r>
-        <w:t>How did you handle countries with missing data in vaccination coverage?</w:t>
-      </w:r>
-    </w:p>
-    <w:p/>
-    <w:p>
-      <w:pPr>
-        <w:numPr>
-          <w:ilvl w:val="0"/>
-          <w:numId w:val="1"/>
-        </w:numPr>
-      </w:pPr>
-      <w:r>
-        <w:t>How did you implement natural immunity and its waning in your model? What do you assume about reduction in severe outcomes due to repeat exposure to the virus?</w:t>
-      </w:r>
-    </w:p>
-    <w:p/>
-    <w:p>
-      <w:pPr>
-        <w:numPr>
-          <w:ilvl w:val="0"/>
-          <w:numId w:val="1"/>
-        </w:numPr>
-      </w:pPr>
-      <w:r>
-        <w:t xml:space="preserve">Do you consider any additional effects of vaccines besides protection against infection and hospitalisation? E.g. Reduction of infectiousness of vaccinated versus unvaccinated cases.  </w:t>
-      </w:r>
-    </w:p>
-    <w:p/>
-    <w:p>
-      <w:pPr>
-        <w:pStyle w:val="Heading3"/>
-      </w:pPr>
-      <w:bookmarkStart w:id="6" w:name="_hlf1s111zor0" w:colFirst="0" w:colLast="0"/>
-      <w:bookmarkEnd w:id="6"/>
-      <w:r>
-        <w:t>Additional data sources</w:t>
-      </w:r>
-    </w:p>
-    <w:p>
-      <w:pPr>
-        <w:numPr>
-          <w:ilvl w:val="0"/>
-          <w:numId w:val="1"/>
-        </w:numPr>
-      </w:pPr>
-      <w:r>
-        <w:t>Does your model include additional data sources besides those provided by the Respicompass platform? Examples include genomic data, virological surveillance data etc.</w:t>
-      </w:r>
-    </w:p>
-    <w:p/>
-    <w:p/>
+      <w:r>
+        <w:t>Team and model: ECDC – flu model</w:t>
+      </w:r>
+    </w:p>
     <w:p/>
     <w:p>
       <w:pPr>
@@ -317,8 +40,8 @@
       <w:pPr>
         <w:pStyle w:val="Heading3"/>
       </w:pPr>
-      <w:bookmarkStart w:id="7" w:name="_lhwn15i5p4hz" w:colFirst="0" w:colLast="0"/>
-      <w:bookmarkEnd w:id="7"/>
+      <w:bookmarkStart w:id="1" w:name="_lhwn15i5p4hz" w:colFirst="0" w:colLast="0"/>
+      <w:bookmarkEnd w:id="1"/>
       <w:r>
         <w:t>Initial conditions and epidemiological context</w:t>
       </w:r>
@@ -382,13 +105,13 @@
         <w:t xml:space="preserve">. </w:t>
       </w:r>
       <w:r>
-        <w:t>By</w:t>
-      </w:r>
-      <w:r>
-        <w:t xml:space="preserve"> approximation, we set beta = rate_infectious * Rnull.</w:t>
-      </w:r>
-      <w:r>
-        <w:t xml:space="preserve"> </w:t>
+        <w:t>By approximation, we set beta = rate_infectious * R</w:t>
+      </w:r>
+      <w:r>
+        <w:t>0</w:t>
+      </w:r>
+      <w:r>
+        <w:t xml:space="preserve">. </w:t>
       </w:r>
       <w:r>
         <w:t>We fit ratio of ILI+ to infection incidence</w:t>
@@ -422,11 +145,7 @@
         <w:t xml:space="preserve">The model fits ILI+ weekly </w:t>
       </w:r>
       <w:r>
-        <w:t xml:space="preserve">rates </w:t>
-      </w:r>
-      <w:r>
-        <w:lastRenderedPageBreak/>
-        <w:t>and</w:t>
+        <w:t>rates and</w:t>
       </w:r>
       <w:r>
         <w:t xml:space="preserve"> assumes that each year the SIR compartments are reset </w:t>
@@ -463,10 +182,25 @@
         <w:t xml:space="preserve"> parameter.</w:t>
       </w:r>
       <w:r>
-        <w:t xml:space="preserve"> As we aim to project a season similar to the three observed baseline seasons, we </w:t>
-      </w:r>
-      <w:r>
-        <w:t>fit the same parameter for all three baseline seasons, which are then used for projecting into the 2024/25 season</w:t>
+        <w:t xml:space="preserve"> As we aim to project a season similar to the three observed baseline seasons, we</w:t>
+      </w:r>
+      <w:r>
+        <w:t xml:space="preserve"> additionally</w:t>
+      </w:r>
+      <w:r>
+        <w:t xml:space="preserve"> </w:t>
+      </w:r>
+      <w:r>
+        <w:t xml:space="preserve">fit </w:t>
+      </w:r>
+      <w:r>
+        <w:t xml:space="preserve">a </w:t>
+      </w:r>
+      <w:r>
+        <w:t xml:space="preserve">single </w:t>
+      </w:r>
+      <w:r>
+        <w:t>parameter for all three baseline seasons, which are then used for projecting into the 2024/25 season</w:t>
       </w:r>
       <w:r>
         <w:t>.</w:t>
@@ -516,10 +250,22 @@
         <w:t xml:space="preserve">no ILI+ data. For the included countries, weeks without ILI+ data </w:t>
       </w:r>
       <w:r>
-        <w:t xml:space="preserve">cause no problem to the model that </w:t>
-      </w:r>
-      <w:r>
-        <w:t>only includes observed ILI+ datapoints into the likelihood.</w:t>
+        <w:t xml:space="preserve">cause no problem to the model </w:t>
+      </w:r>
+      <w:r>
+        <w:t>as</w:t>
+      </w:r>
+      <w:r>
+        <w:t xml:space="preserve"> </w:t>
+      </w:r>
+      <w:r>
+        <w:t xml:space="preserve">only observed ILI+ datapoints </w:t>
+      </w:r>
+      <w:r>
+        <w:t xml:space="preserve">are included </w:t>
+      </w:r>
+      <w:r>
+        <w:t>into the likelihood.</w:t>
       </w:r>
       <w:r>
         <w:t xml:space="preserve"> </w:t>
@@ -558,6 +304,7 @@
         </w:numPr>
       </w:pPr>
       <w:r>
+        <w:lastRenderedPageBreak/>
         <w:t>How did you implement the increase of transmission potential (scenarios B, D, F) in your model?</w:t>
       </w:r>
     </w:p>
@@ -574,8 +321,8 @@
       <w:pPr>
         <w:pStyle w:val="Heading3"/>
       </w:pPr>
-      <w:bookmarkStart w:id="8" w:name="_92guv0ko4euq" w:colFirst="0" w:colLast="0"/>
-      <w:bookmarkEnd w:id="8"/>
+      <w:bookmarkStart w:id="2" w:name="_92guv0ko4euq" w:colFirst="0" w:colLast="0"/>
+      <w:bookmarkEnd w:id="2"/>
       <w:r>
         <w:t>Specific groups/Risk Groups</w:t>
       </w:r>
@@ -629,10 +376,9 @@
       <w:pPr>
         <w:pStyle w:val="Heading3"/>
       </w:pPr>
-      <w:bookmarkStart w:id="9" w:name="_66yvtog96i08" w:colFirst="0" w:colLast="0"/>
-      <w:bookmarkEnd w:id="9"/>
-      <w:r>
-        <w:lastRenderedPageBreak/>
+      <w:bookmarkStart w:id="3" w:name="_66yvtog96i08" w:colFirst="0" w:colLast="0"/>
+      <w:bookmarkEnd w:id="3"/>
+      <w:r>
         <w:t>Contact patterns</w:t>
       </w:r>
     </w:p>
@@ -647,6 +393,7 @@
         <w:t>Does your model consider country-specific population demographics and contact rates? If yes, how did you estimate country-specific contact rates?</w:t>
       </w:r>
     </w:p>
+    <w:p/>
     <w:p>
       <w:r>
         <w:t xml:space="preserve">We use country specific demographic data as available </w:t>
@@ -701,8 +448,8 @@
       <w:pPr>
         <w:pStyle w:val="Heading3"/>
       </w:pPr>
-      <w:bookmarkStart w:id="10" w:name="_xjaci5d9m3zy" w:colFirst="0" w:colLast="0"/>
-      <w:bookmarkEnd w:id="10"/>
+      <w:bookmarkStart w:id="4" w:name="_xjaci5d9m3zy" w:colFirst="0" w:colLast="0"/>
+      <w:bookmarkEnd w:id="4"/>
       <w:r>
         <w:t>Behaviour and Mobility/Travel</w:t>
       </w:r>
@@ -747,8 +494,8 @@
       <w:pPr>
         <w:pStyle w:val="Heading3"/>
       </w:pPr>
-      <w:bookmarkStart w:id="11" w:name="_i23xvt6l2kyf" w:colFirst="0" w:colLast="0"/>
-      <w:bookmarkEnd w:id="11"/>
+      <w:bookmarkStart w:id="5" w:name="_i23xvt6l2kyf" w:colFirst="0" w:colLast="0"/>
+      <w:bookmarkEnd w:id="5"/>
       <w:r>
         <w:t>Immunity and Vaccination</w:t>
       </w:r>
@@ -824,7 +571,6 @@
         </w:numPr>
       </w:pPr>
       <w:r>
-        <w:lastRenderedPageBreak/>
         <w:t>Do you consider any additional effects of vaccines besides protection against symptomatic disease? E.g. reduced infectiousness of vaccinated versus unvaccinated cases.</w:t>
       </w:r>
     </w:p>
@@ -897,7 +643,13 @@
         <w:t xml:space="preserve">is the incidence of fully-immunising infections, which is </w:t>
       </w:r>
       <w:r>
-        <w:t>a faction of the</w:t>
+        <w:t>a f</w:t>
+      </w:r>
+      <w:r>
+        <w:t>r</w:t>
+      </w:r>
+      <w:r>
+        <w:t>action of the</w:t>
       </w:r>
       <w:r>
         <w:t xml:space="preserve"> incidence </w:t>
@@ -941,8 +693,8 @@
       <w:pPr>
         <w:pStyle w:val="Heading3"/>
       </w:pPr>
-      <w:bookmarkStart w:id="12" w:name="_ickoy4c4z1y1" w:colFirst="0" w:colLast="0"/>
-      <w:bookmarkEnd w:id="12"/>
+      <w:bookmarkStart w:id="6" w:name="_ickoy4c4z1y1" w:colFirst="0" w:colLast="0"/>
+      <w:bookmarkEnd w:id="6"/>
       <w:r>
         <w:t>Additional data sources</w:t>
       </w:r>
@@ -956,6 +708,12 @@
       </w:pPr>
       <w:r>
         <w:t>Does your model include additional data sources besides those provided by the Respicompass platform? Examples include genomic data, virological surveillance data etc.</w:t>
+      </w:r>
+    </w:p>
+    <w:p/>
+    <w:p>
+      <w:r>
+        <w:t>No.</w:t>
       </w:r>
     </w:p>
     <w:p/>

</xml_diff>